<commit_message>
docs: update student name to Ignacio Salazar and professor name to Rafael Vidal in technical report
</commit_message>
<xml_diff>
--- a/INFORME_TECNICO_DEVOPS.docx
+++ b/INFORME_TECNICO_DEVOPS.docx
@@ -52,14 +52,14 @@
           <w:b/>
           <w:sz w:val="22"/>
         </w:rPr>
-        <w:t>Integrantes del Proyecto:</w:t>
+        <w:t>Integrante del Proyecto:</w:t>
       </w:r>
       <w:r>
         <w:rPr>
           <w:rFonts w:ascii="Calibri" w:hAnsi="Calibri"/>
           <w:sz w:val="22"/>
         </w:rPr>
-        <w:t xml:space="preserve"> [Nombre de los Estudiantes]</w:t>
+        <w:t xml:space="preserve"> Ignacio Salazar</w:t>
       </w:r>
     </w:p>
     <w:p>
@@ -82,7 +82,7 @@
           <w:rFonts w:ascii="Calibri" w:hAnsi="Calibri"/>
           <w:sz w:val="22"/>
         </w:rPr>
-        <w:t xml:space="preserve"> [Nombre del Docente]</w:t>
+        <w:t xml:space="preserve"> Rafael Vidal</w:t>
       </w:r>
     </w:p>
     <w:p>

</xml_diff>